<commit_message>
feat(benchmark): document cache benchmark
</commit_message>
<xml_diff>
--- a/docs/HIA-BDOPTIMIZACION.docx
+++ b/docs/HIA-BDOPTIMIZACION.docx
@@ -12323,6 +12323,301 @@
         <w:rPr>
           <w:rtl w:val="0"/>
         </w:rPr>
+      </w:r>
+    </w:p>
+    <w:p>
+      <w:pPr>
+        <w:pStyle w:val="Heading1"/>
+      </w:pPr>
+      <w:r>
+        <w:t>23. Benchmark de caché frío vs. caché caliente sobre 6M filas</w:t>
+      </w:r>
+    </w:p>
+    <w:p>
+      <w:r>
+        <w:t>Objetivo: medir el impacto del InnoDB Buffer Pool sobre una consulta agregada ejecutada contra la tabla Reserva con 6.000.000 de registros.</w:t>
+      </w:r>
+    </w:p>
+    <w:p>
+      <w:r>
+        <w:t>Consulta evaluada:</w:t>
+      </w:r>
+    </w:p>
+    <w:p>
+      <w:r>
+        <w:rPr>
+          <w:rFonts w:ascii="Courier New" w:hAnsi="Courier New"/>
+          <w:sz w:val="18"/>
+        </w:rPr>
+        <w:t>SELECT estado_reserva, COUNT(*) AS total</w:t>
+        <w:br/>
+        <w:t>FROM reserva</w:t>
+        <w:br/>
+        <w:t>WHERE fecha_inicio BETWEEN '2023-06-01' AND '2023-12-31'</w:t>
+        <w:br/>
+        <w:t>GROUP BY estado_reserva;</w:t>
+      </w:r>
+    </w:p>
+    <w:p>
+      <w:pPr>
+        <w:pStyle w:val="Heading2"/>
+      </w:pPr>
+      <w:r>
+        <w:t>23.1. Datos verificados y resultados</w:t>
+      </w:r>
+    </w:p>
+    <w:p>
+      <w:r>
+        <w:t>Tabla evaluada: reserva. Volumen verificado: 6.000.000 filas. Script ejecutado: src/test_cache.py.</w:t>
+      </w:r>
+    </w:p>
+    <w:tbl>
+      <w:tblPr>
+        <w:tblW w:type="auto" w:w="0"/>
+        <w:tblLook w:firstColumn="1" w:firstRow="1" w:lastColumn="0" w:lastRow="0" w:noHBand="0" w:noVBand="1" w:val="04A0"/>
+      </w:tblPr>
+      <w:tblGrid>
+        <w:gridCol w:w="2835"/>
+        <w:gridCol w:w="2835"/>
+        <w:gridCol w:w="2835"/>
+      </w:tblGrid>
+      <w:tr>
+        <w:tc>
+          <w:tcPr>
+            <w:tcW w:type="dxa" w:w="2835"/>
+          </w:tcPr>
+          <w:p>
+            <w:r>
+              <w:t>Corrida</w:t>
+            </w:r>
+          </w:p>
+        </w:tc>
+        <w:tc>
+          <w:tcPr>
+            <w:tcW w:type="dxa" w:w="2835"/>
+          </w:tcPr>
+          <w:p>
+            <w:r>
+              <w:t>Condición observada</w:t>
+            </w:r>
+          </w:p>
+        </w:tc>
+        <w:tc>
+          <w:tcPr>
+            <w:tcW w:type="dxa" w:w="2835"/>
+          </w:tcPr>
+          <w:p>
+            <w:r>
+              <w:t>Tiempo</w:t>
+            </w:r>
+          </w:p>
+        </w:tc>
+      </w:tr>
+      <w:tr>
+        <w:tc>
+          <w:tcPr>
+            <w:tcW w:type="dxa" w:w="2835"/>
+          </w:tcPr>
+          <w:p>
+            <w:r>
+              <w:t>1</w:t>
+            </w:r>
+          </w:p>
+        </w:tc>
+        <w:tc>
+          <w:tcPr>
+            <w:tcW w:type="dxa" w:w="2835"/>
+          </w:tcPr>
+          <w:p>
+            <w:r>
+              <w:t>Primera ejecución / caché frío relativo</w:t>
+            </w:r>
+          </w:p>
+        </w:tc>
+        <w:tc>
+          <w:tcPr>
+            <w:tcW w:type="dxa" w:w="2835"/>
+          </w:tcPr>
+          <w:p>
+            <w:r>
+              <w:t>15,4395 s</w:t>
+            </w:r>
+          </w:p>
+        </w:tc>
+      </w:tr>
+      <w:tr>
+        <w:tc>
+          <w:tcPr>
+            <w:tcW w:type="dxa" w:w="2835"/>
+          </w:tcPr>
+          <w:p>
+            <w:r>
+              <w:t>2</w:t>
+            </w:r>
+          </w:p>
+        </w:tc>
+        <w:tc>
+          <w:tcPr>
+            <w:tcW w:type="dxa" w:w="2835"/>
+          </w:tcPr>
+          <w:p>
+            <w:r>
+              <w:t>Caché caliente</w:t>
+            </w:r>
+          </w:p>
+        </w:tc>
+        <w:tc>
+          <w:tcPr>
+            <w:tcW w:type="dxa" w:w="2835"/>
+          </w:tcPr>
+          <w:p>
+            <w:r>
+              <w:t>11,0120 s</w:t>
+            </w:r>
+          </w:p>
+        </w:tc>
+      </w:tr>
+      <w:tr>
+        <w:tc>
+          <w:tcPr>
+            <w:tcW w:type="dxa" w:w="2835"/>
+          </w:tcPr>
+          <w:p>
+            <w:r>
+              <w:t>3</w:t>
+            </w:r>
+          </w:p>
+        </w:tc>
+        <w:tc>
+          <w:tcPr>
+            <w:tcW w:type="dxa" w:w="2835"/>
+          </w:tcPr>
+          <w:p>
+            <w:r>
+              <w:t>Caché caliente</w:t>
+            </w:r>
+          </w:p>
+        </w:tc>
+        <w:tc>
+          <w:tcPr>
+            <w:tcW w:type="dxa" w:w="2835"/>
+          </w:tcPr>
+          <w:p>
+            <w:r>
+              <w:t>10,0301 s</w:t>
+            </w:r>
+          </w:p>
+        </w:tc>
+      </w:tr>
+    </w:tbl>
+    <w:p>
+      <w:r>
+        <w:t>Resultados devueltos por la consulta: Cancelada = 191.979, Confirmada = 255.964, Finalizada = 833.910.</w:t>
+      </w:r>
+    </w:p>
+    <w:p>
+      <w:r>
+        <w:t>Speedup informado por el script, comparando la primera corrida contra la segunda: 1,40x. Comparando contra la tercera corrida: 1,54x. Usando el promedio caliente de las corridas 2 y 3 (10,52105 s), el speedup promedio es 1,47x.</w:t>
+      </w:r>
+    </w:p>
+    <w:p>
+      <w:pPr>
+        <w:pStyle w:val="Heading2"/>
+      </w:pPr>
+      <w:r>
+        <w:t>23.2. Plan de ejecución EXPLAIN FORMAT=JSON</w:t>
+      </w:r>
+    </w:p>
+    <w:p>
+      <w:r>
+        <w:rPr>
+          <w:rFonts w:ascii="Courier New" w:hAnsi="Courier New"/>
+          <w:sz w:val="18"/>
+        </w:rPr>
+        <w:t>{</w:t>
+        <w:br/>
+        <w:t xml:space="preserve">  "query_block": {</w:t>
+        <w:br/>
+        <w:t xml:space="preserve">    "select_id": 1,</w:t>
+        <w:br/>
+        <w:t xml:space="preserve">    "filesort": {</w:t>
+        <w:br/>
+        <w:t xml:space="preserve">      "sort_key": "reserva.estado_reserva",</w:t>
+        <w:br/>
+        <w:t xml:space="preserve">      "temporary_table": {</w:t>
+        <w:br/>
+        <w:t xml:space="preserve">        "table": {</w:t>
+        <w:br/>
+        <w:t xml:space="preserve">          "table_name": "reserva",</w:t>
+        <w:br/>
+        <w:t xml:space="preserve">          "access_type": "ALL",</w:t>
+        <w:br/>
+        <w:t xml:space="preserve">          "rows": 5740499,</w:t>
+        <w:br/>
+        <w:t xml:space="preserve">          "filtered": 100,</w:t>
+        <w:br/>
+        <w:t xml:space="preserve">          "attached_condition": "reserva.fecha_inicio between &lt;cache&gt;('2023-06-01') and &lt;cache&gt;('2023-12-31')"</w:t>
+        <w:br/>
+        <w:t xml:space="preserve">        }</w:t>
+        <w:br/>
+        <w:t xml:space="preserve">      }</w:t>
+        <w:br/>
+        <w:t xml:space="preserve">    }</w:t>
+        <w:br/>
+        <w:t xml:space="preserve">  }</w:t>
+        <w:br/>
+        <w:t>}</w:t>
+      </w:r>
+    </w:p>
+    <w:p>
+      <w:r>
+        <w:t>Lectura del plan: access_type = ALL indica un recorrido completo de la tabla reserva. El optimizador estima leer aproximadamente 5.740.499 filas, aplicar el filtro por fecha_inicio durante el escaneo y luego agrupar por estado_reserva usando tabla temporal y filesort. El plan es consistente con una consulta analítica de baja selectividad sobre millones de filas: el costo dominante es leer muchas páginas y agregarlas, no ubicar una fila puntual.</w:t>
+      </w:r>
+    </w:p>
+    <w:p>
+      <w:pPr>
+        <w:pStyle w:val="Heading2"/>
+      </w:pPr>
+      <w:r>
+        <w:t>23.3. Explicación técnica: disco, páginas y Buffer Pool</w:t>
+      </w:r>
+    </w:p>
+    <w:p>
+      <w:r>
+        <w:t>InnoDB no lee registros aislados directamente desde disco en cada acceso lógico: trabaja con páginas de datos, usualmente de 16 KB, que se cargan en el InnoDB Buffer Pool. El Buffer Pool es la memoria caché principal del motor para páginas de datos e índices.</w:t>
+      </w:r>
+    </w:p>
+    <w:p>
+      <w:r>
+        <w:t>En la primera corrida, una porción importante de las páginas necesarias para recorrer Reserva todavía no está residente en RAM. El motor debe resolver más lecturas físicas desde disco o SSD, atravesando el sistema operativo y el dispositivo de almacenamiento. Esa ruta es más lenta que una lectura lógica en memoria.</w:t>
+      </w:r>
+    </w:p>
+    <w:p>
+      <w:r>
+        <w:t>En las corridas siguientes, muchas de las mismas páginas ya quedaron cargadas en el Buffer Pool. La consulta sigue haciendo un escaneo grande, pero una fracción mayor de las lecturas se resuelve en RAM. Por eso el tiempo cae desde 15,4395 s a valores cercanos a 10–11 s.</w:t>
+      </w:r>
+    </w:p>
+    <w:p>
+      <w:r>
+        <w:t>La mejora no vuelve instantánea la consulta porque el plan sigue siendo un full table scan con agregación. Aunque las páginas estén calientes, MySQL todavía debe recorrer millones de registros, evaluar el rango de fechas, contar por estado_reserva y agrupar. El caché reduce el costo de I/O, pero no elimina el costo de CPU ni el costo algorítmico de procesar una parte grande de la tabla.</w:t>
+      </w:r>
+    </w:p>
+    <w:p>
+      <w:r>
+        <w:t>InnoDB administra el Buffer Pool con una política cercana a LRU: conserva páginas usadas recientemente y desplaza páginas menos útiles cuando necesita espacio. Ejecutar repetidamente la misma consulta favorece que las páginas de Reserva y estructuras auxiliares permanezcan residentes, generando el efecto de caché caliente observado.</w:t>
+      </w:r>
+    </w:p>
+    <w:p>
+      <w:pPr>
+        <w:pStyle w:val="Heading2"/>
+      </w:pPr>
+      <w:r>
+        <w:t>23.4. Nota metodológica</w:t>
+      </w:r>
+    </w:p>
+    <w:p>
+      <w:r>
+        <w:t>El script mide una primera corrida seguida de corridas posteriores. Eso permite observar el efecto práctico de calentamiento del Buffer Pool. Para un experimento de caché frío estricto habría que controlar explícitamente el estado del servidor, por ejemplo reiniciando MySQL/MariaDB o limpiando el Buffer Pool. No se automatizó esa operación para evitar efectos destructivos o dependientes del entorno local.</w:t>
       </w:r>
     </w:p>
     <w:sectPr>

</xml_diff>

<commit_message>
feat(benchmark): document cache benchmark (#6)
</commit_message>
<xml_diff>
--- a/docs/HIA-BDOPTIMIZACION.docx
+++ b/docs/HIA-BDOPTIMIZACION.docx
@@ -12323,6 +12323,301 @@
         <w:rPr>
           <w:rtl w:val="0"/>
         </w:rPr>
+      </w:r>
+    </w:p>
+    <w:p>
+      <w:pPr>
+        <w:pStyle w:val="Heading1"/>
+      </w:pPr>
+      <w:r>
+        <w:t>23. Benchmark de caché frío vs. caché caliente sobre 6M filas</w:t>
+      </w:r>
+    </w:p>
+    <w:p>
+      <w:r>
+        <w:t>Objetivo: medir el impacto del InnoDB Buffer Pool sobre una consulta agregada ejecutada contra la tabla Reserva con 6.000.000 de registros.</w:t>
+      </w:r>
+    </w:p>
+    <w:p>
+      <w:r>
+        <w:t>Consulta evaluada:</w:t>
+      </w:r>
+    </w:p>
+    <w:p>
+      <w:r>
+        <w:rPr>
+          <w:rFonts w:ascii="Courier New" w:hAnsi="Courier New"/>
+          <w:sz w:val="18"/>
+        </w:rPr>
+        <w:t>SELECT estado_reserva, COUNT(*) AS total</w:t>
+        <w:br/>
+        <w:t>FROM reserva</w:t>
+        <w:br/>
+        <w:t>WHERE fecha_inicio BETWEEN '2023-06-01' AND '2023-12-31'</w:t>
+        <w:br/>
+        <w:t>GROUP BY estado_reserva;</w:t>
+      </w:r>
+    </w:p>
+    <w:p>
+      <w:pPr>
+        <w:pStyle w:val="Heading2"/>
+      </w:pPr>
+      <w:r>
+        <w:t>23.1. Datos verificados y resultados</w:t>
+      </w:r>
+    </w:p>
+    <w:p>
+      <w:r>
+        <w:t>Tabla evaluada: reserva. Volumen verificado: 6.000.000 filas. Script ejecutado: src/test_cache.py.</w:t>
+      </w:r>
+    </w:p>
+    <w:tbl>
+      <w:tblPr>
+        <w:tblW w:type="auto" w:w="0"/>
+        <w:tblLook w:firstColumn="1" w:firstRow="1" w:lastColumn="0" w:lastRow="0" w:noHBand="0" w:noVBand="1" w:val="04A0"/>
+      </w:tblPr>
+      <w:tblGrid>
+        <w:gridCol w:w="2835"/>
+        <w:gridCol w:w="2835"/>
+        <w:gridCol w:w="2835"/>
+      </w:tblGrid>
+      <w:tr>
+        <w:tc>
+          <w:tcPr>
+            <w:tcW w:type="dxa" w:w="2835"/>
+          </w:tcPr>
+          <w:p>
+            <w:r>
+              <w:t>Corrida</w:t>
+            </w:r>
+          </w:p>
+        </w:tc>
+        <w:tc>
+          <w:tcPr>
+            <w:tcW w:type="dxa" w:w="2835"/>
+          </w:tcPr>
+          <w:p>
+            <w:r>
+              <w:t>Condición observada</w:t>
+            </w:r>
+          </w:p>
+        </w:tc>
+        <w:tc>
+          <w:tcPr>
+            <w:tcW w:type="dxa" w:w="2835"/>
+          </w:tcPr>
+          <w:p>
+            <w:r>
+              <w:t>Tiempo</w:t>
+            </w:r>
+          </w:p>
+        </w:tc>
+      </w:tr>
+      <w:tr>
+        <w:tc>
+          <w:tcPr>
+            <w:tcW w:type="dxa" w:w="2835"/>
+          </w:tcPr>
+          <w:p>
+            <w:r>
+              <w:t>1</w:t>
+            </w:r>
+          </w:p>
+        </w:tc>
+        <w:tc>
+          <w:tcPr>
+            <w:tcW w:type="dxa" w:w="2835"/>
+          </w:tcPr>
+          <w:p>
+            <w:r>
+              <w:t>Primera ejecución / caché frío relativo</w:t>
+            </w:r>
+          </w:p>
+        </w:tc>
+        <w:tc>
+          <w:tcPr>
+            <w:tcW w:type="dxa" w:w="2835"/>
+          </w:tcPr>
+          <w:p>
+            <w:r>
+              <w:t>15,4395 s</w:t>
+            </w:r>
+          </w:p>
+        </w:tc>
+      </w:tr>
+      <w:tr>
+        <w:tc>
+          <w:tcPr>
+            <w:tcW w:type="dxa" w:w="2835"/>
+          </w:tcPr>
+          <w:p>
+            <w:r>
+              <w:t>2</w:t>
+            </w:r>
+          </w:p>
+        </w:tc>
+        <w:tc>
+          <w:tcPr>
+            <w:tcW w:type="dxa" w:w="2835"/>
+          </w:tcPr>
+          <w:p>
+            <w:r>
+              <w:t>Caché caliente</w:t>
+            </w:r>
+          </w:p>
+        </w:tc>
+        <w:tc>
+          <w:tcPr>
+            <w:tcW w:type="dxa" w:w="2835"/>
+          </w:tcPr>
+          <w:p>
+            <w:r>
+              <w:t>11,0120 s</w:t>
+            </w:r>
+          </w:p>
+        </w:tc>
+      </w:tr>
+      <w:tr>
+        <w:tc>
+          <w:tcPr>
+            <w:tcW w:type="dxa" w:w="2835"/>
+          </w:tcPr>
+          <w:p>
+            <w:r>
+              <w:t>3</w:t>
+            </w:r>
+          </w:p>
+        </w:tc>
+        <w:tc>
+          <w:tcPr>
+            <w:tcW w:type="dxa" w:w="2835"/>
+          </w:tcPr>
+          <w:p>
+            <w:r>
+              <w:t>Caché caliente</w:t>
+            </w:r>
+          </w:p>
+        </w:tc>
+        <w:tc>
+          <w:tcPr>
+            <w:tcW w:type="dxa" w:w="2835"/>
+          </w:tcPr>
+          <w:p>
+            <w:r>
+              <w:t>10,0301 s</w:t>
+            </w:r>
+          </w:p>
+        </w:tc>
+      </w:tr>
+    </w:tbl>
+    <w:p>
+      <w:r>
+        <w:t>Resultados devueltos por la consulta: Cancelada = 191.979, Confirmada = 255.964, Finalizada = 833.910.</w:t>
+      </w:r>
+    </w:p>
+    <w:p>
+      <w:r>
+        <w:t>Speedup informado por el script, comparando la primera corrida contra la segunda: 1,40x. Comparando contra la tercera corrida: 1,54x. Usando el promedio caliente de las corridas 2 y 3 (10,52105 s), el speedup promedio es 1,47x.</w:t>
+      </w:r>
+    </w:p>
+    <w:p>
+      <w:pPr>
+        <w:pStyle w:val="Heading2"/>
+      </w:pPr>
+      <w:r>
+        <w:t>23.2. Plan de ejecución EXPLAIN FORMAT=JSON</w:t>
+      </w:r>
+    </w:p>
+    <w:p>
+      <w:r>
+        <w:rPr>
+          <w:rFonts w:ascii="Courier New" w:hAnsi="Courier New"/>
+          <w:sz w:val="18"/>
+        </w:rPr>
+        <w:t>{</w:t>
+        <w:br/>
+        <w:t xml:space="preserve">  "query_block": {</w:t>
+        <w:br/>
+        <w:t xml:space="preserve">    "select_id": 1,</w:t>
+        <w:br/>
+        <w:t xml:space="preserve">    "filesort": {</w:t>
+        <w:br/>
+        <w:t xml:space="preserve">      "sort_key": "reserva.estado_reserva",</w:t>
+        <w:br/>
+        <w:t xml:space="preserve">      "temporary_table": {</w:t>
+        <w:br/>
+        <w:t xml:space="preserve">        "table": {</w:t>
+        <w:br/>
+        <w:t xml:space="preserve">          "table_name": "reserva",</w:t>
+        <w:br/>
+        <w:t xml:space="preserve">          "access_type": "ALL",</w:t>
+        <w:br/>
+        <w:t xml:space="preserve">          "rows": 5740499,</w:t>
+        <w:br/>
+        <w:t xml:space="preserve">          "filtered": 100,</w:t>
+        <w:br/>
+        <w:t xml:space="preserve">          "attached_condition": "reserva.fecha_inicio between &lt;cache&gt;('2023-06-01') and &lt;cache&gt;('2023-12-31')"</w:t>
+        <w:br/>
+        <w:t xml:space="preserve">        }</w:t>
+        <w:br/>
+        <w:t xml:space="preserve">      }</w:t>
+        <w:br/>
+        <w:t xml:space="preserve">    }</w:t>
+        <w:br/>
+        <w:t xml:space="preserve">  }</w:t>
+        <w:br/>
+        <w:t>}</w:t>
+      </w:r>
+    </w:p>
+    <w:p>
+      <w:r>
+        <w:t>Lectura del plan: access_type = ALL indica un recorrido completo de la tabla reserva. El optimizador estima leer aproximadamente 5.740.499 filas, aplicar el filtro por fecha_inicio durante el escaneo y luego agrupar por estado_reserva usando tabla temporal y filesort. El plan es consistente con una consulta analítica de baja selectividad sobre millones de filas: el costo dominante es leer muchas páginas y agregarlas, no ubicar una fila puntual.</w:t>
+      </w:r>
+    </w:p>
+    <w:p>
+      <w:pPr>
+        <w:pStyle w:val="Heading2"/>
+      </w:pPr>
+      <w:r>
+        <w:t>23.3. Explicación técnica: disco, páginas y Buffer Pool</w:t>
+      </w:r>
+    </w:p>
+    <w:p>
+      <w:r>
+        <w:t>InnoDB no lee registros aislados directamente desde disco en cada acceso lógico: trabaja con páginas de datos, usualmente de 16 KB, que se cargan en el InnoDB Buffer Pool. El Buffer Pool es la memoria caché principal del motor para páginas de datos e índices.</w:t>
+      </w:r>
+    </w:p>
+    <w:p>
+      <w:r>
+        <w:t>En la primera corrida, una porción importante de las páginas necesarias para recorrer Reserva todavía no está residente en RAM. El motor debe resolver más lecturas físicas desde disco o SSD, atravesando el sistema operativo y el dispositivo de almacenamiento. Esa ruta es más lenta que una lectura lógica en memoria.</w:t>
+      </w:r>
+    </w:p>
+    <w:p>
+      <w:r>
+        <w:t>En las corridas siguientes, muchas de las mismas páginas ya quedaron cargadas en el Buffer Pool. La consulta sigue haciendo un escaneo grande, pero una fracción mayor de las lecturas se resuelve en RAM. Por eso el tiempo cae desde 15,4395 s a valores cercanos a 10–11 s.</w:t>
+      </w:r>
+    </w:p>
+    <w:p>
+      <w:r>
+        <w:t>La mejora no vuelve instantánea la consulta porque el plan sigue siendo un full table scan con agregación. Aunque las páginas estén calientes, MySQL todavía debe recorrer millones de registros, evaluar el rango de fechas, contar por estado_reserva y agrupar. El caché reduce el costo de I/O, pero no elimina el costo de CPU ni el costo algorítmico de procesar una parte grande de la tabla.</w:t>
+      </w:r>
+    </w:p>
+    <w:p>
+      <w:r>
+        <w:t>InnoDB administra el Buffer Pool con una política cercana a LRU: conserva páginas usadas recientemente y desplaza páginas menos útiles cuando necesita espacio. Ejecutar repetidamente la misma consulta favorece que las páginas de Reserva y estructuras auxiliares permanezcan residentes, generando el efecto de caché caliente observado.</w:t>
+      </w:r>
+    </w:p>
+    <w:p>
+      <w:pPr>
+        <w:pStyle w:val="Heading2"/>
+      </w:pPr>
+      <w:r>
+        <w:t>23.4. Nota metodológica</w:t>
+      </w:r>
+    </w:p>
+    <w:p>
+      <w:r>
+        <w:t>El script mide una primera corrida seguida de corridas posteriores. Eso permite observar el efecto práctico de calentamiento del Buffer Pool. Para un experimento de caché frío estricto habría que controlar explícitamente el estado del servidor, por ejemplo reiniciando MySQL/MariaDB o limpiando el Buffer Pool. No se automatizó esa operación para evitar efectos destructivos o dependientes del entorno local.</w:t>
       </w:r>
     </w:p>
     <w:sectPr>

</xml_diff>